<commit_message>
OVGU-Design, Anpassung an alle Jahrgangsstufen, SCORM für Moodle, LISA-Unterlagen
- Corporate Design der OVGU (Logo FHW, Hausfarbe, Fakultätsfarbe, Lucida Sans)
  für Folien, Word-Dateien und LiaScript-Module
- Klasse 7 nur noch als Beispiel: Anpassungsleitfaden für Kl. 5/6, 7/8, 9/10
  und Sek II; gemeinsame Referenz-Jahrgangsstufe in Sitzung 3;
  Unterrichtsmaterial ohne Klassenstufe im Dateinamen
- SCORM-1.2-Pakete der Selbstlernmodule (moodle/) mit Build-Skript und
  Anleitung zur Einrichtung im Bildungsportal
- Unterlagen zur Anerkennung durch das LISA: Verfahren, Kursprogramm,
  Einladung, Ausfüllhilfe, Teilnahmebescheinigung, Anfrage
- Word-Konverter: nummerierte Listen beginnen neu, leere Kopfzeilen entfallen

Co-Authored-By: Claude Opus 5.5 <noreply@anthropic.com>
</commit_message>
<xml_diff>
--- a/Session_1_Aufbau_und_EVA/S1_Arbeitsheft.docx
+++ b/Session_1_Aufbau_und_EVA/S1_Arbeitsheft.docx
@@ -36,9 +36,9 @@
     <w:p>
       <w:pPr>
         <w:pBdr>
-          <w:left w:val="single" w:color="0B6E69" w:sz="18" w:space="6"/>
+          <w:left w:val="single" w:color="EF7D00" w:sz="18" w:space="6"/>
         </w:pBdr>
-        <w:shd w:fill="E6F2F1" w:color="auto" w:val="clear"/>
+        <w:shd w:fill="FDF0E3" w:color="auto" w:val="clear"/>
         <w:spacing w:after="60" w:before="60"/>
         <w:ind w:left="200" w:right="200"/>
       </w:pPr>
@@ -57,12 +57,12 @@
       <w:tblPr>
         <w:tblW w:type="dxa" w:w="9706"/>
         <w:tblBorders>
-          <w:top w:val="single" w:color="9DB8B6" w:sz="4"/>
-          <w:left w:val="single" w:color="9DB8B6" w:sz="4"/>
-          <w:bottom w:val="single" w:color="9DB8B6" w:sz="4"/>
-          <w:right w:val="single" w:color="9DB8B6" w:sz="4"/>
-          <w:insideH w:val="single" w:color="9DB8B6" w:sz="4"/>
-          <w:insideV w:val="single" w:color="9DB8B6" w:sz="4"/>
+          <w:top w:val="single" w:color="BFBFBF" w:sz="4"/>
+          <w:left w:val="single" w:color="BFBFBF" w:sz="4"/>
+          <w:bottom w:val="single" w:color="BFBFBF" w:sz="4"/>
+          <w:right w:val="single" w:color="BFBFBF" w:sz="4"/>
+          <w:insideH w:val="single" w:color="BFBFBF" w:sz="4"/>
+          <w:insideV w:val="single" w:color="BFBFBF" w:sz="4"/>
         </w:tblBorders>
         <w:tblLayout w:type="fixed"/>
       </w:tblPr>
@@ -77,7 +77,7 @@
         <w:tc>
           <w:tcPr>
             <w:tcW w:type="dxa" w:w="2135"/>
-            <w:shd w:fill="E6F2F1" w:color="auto" w:val="clear"/>
+            <w:shd w:fill="FDF0E3" w:color="auto" w:val="clear"/>
             <w:tcMar>
               <w:top w:type="dxa" w:w="60"/>
               <w:left w:type="dxa" w:w="100"/>
@@ -98,7 +98,7 @@
         <w:tc>
           <w:tcPr>
             <w:tcW w:type="dxa" w:w="7474"/>
-            <w:shd w:fill="E6F2F1" w:color="auto" w:val="clear"/>
+            <w:shd w:fill="FDF0E3" w:color="auto" w:val="clear"/>
             <w:tcMar>
               <w:top w:type="dxa" w:w="60"/>
               <w:left w:type="dxa" w:w="100"/>
@@ -309,12 +309,12 @@
       <w:tblPr>
         <w:tblW w:type="dxa" w:w="9706"/>
         <w:tblBorders>
-          <w:top w:val="single" w:color="9DB8B6" w:sz="4"/>
-          <w:left w:val="single" w:color="9DB8B6" w:sz="4"/>
-          <w:bottom w:val="single" w:color="9DB8B6" w:sz="4"/>
-          <w:right w:val="single" w:color="9DB8B6" w:sz="4"/>
-          <w:insideH w:val="single" w:color="9DB8B6" w:sz="4"/>
-          <w:insideV w:val="single" w:color="9DB8B6" w:sz="4"/>
+          <w:top w:val="single" w:color="BFBFBF" w:sz="4"/>
+          <w:left w:val="single" w:color="BFBFBF" w:sz="4"/>
+          <w:bottom w:val="single" w:color="BFBFBF" w:sz="4"/>
+          <w:right w:val="single" w:color="BFBFBF" w:sz="4"/>
+          <w:insideH w:val="single" w:color="BFBFBF" w:sz="4"/>
+          <w:insideV w:val="single" w:color="BFBFBF" w:sz="4"/>
         </w:tblBorders>
         <w:tblLayout w:type="fixed"/>
       </w:tblPr>
@@ -332,7 +332,7 @@
         <w:tc>
           <w:tcPr>
             <w:tcW w:type="dxa" w:w="5435"/>
-            <w:shd w:fill="E6F2F1" w:color="auto" w:val="clear"/>
+            <w:shd w:fill="FDF0E3" w:color="auto" w:val="clear"/>
             <w:tcMar>
               <w:top w:type="dxa" w:w="60"/>
               <w:left w:type="dxa" w:w="100"/>
@@ -353,7 +353,7 @@
         <w:tc>
           <w:tcPr>
             <w:tcW w:type="dxa" w:w="971"/>
-            <w:shd w:fill="E6F2F1" w:color="auto" w:val="clear"/>
+            <w:shd w:fill="FDF0E3" w:color="auto" w:val="clear"/>
             <w:tcMar>
               <w:top w:type="dxa" w:w="60"/>
               <w:left w:type="dxa" w:w="100"/>
@@ -374,7 +374,7 @@
         <w:tc>
           <w:tcPr>
             <w:tcW w:type="dxa" w:w="971"/>
-            <w:shd w:fill="E6F2F1" w:color="auto" w:val="clear"/>
+            <w:shd w:fill="FDF0E3" w:color="auto" w:val="clear"/>
             <w:tcMar>
               <w:top w:type="dxa" w:w="60"/>
               <w:left w:type="dxa" w:w="100"/>
@@ -395,7 +395,7 @@
         <w:tc>
           <w:tcPr>
             <w:tcW w:type="dxa" w:w="971"/>
-            <w:shd w:fill="E6F2F1" w:color="auto" w:val="clear"/>
+            <w:shd w:fill="FDF0E3" w:color="auto" w:val="clear"/>
             <w:tcMar>
               <w:top w:type="dxa" w:w="60"/>
               <w:left w:type="dxa" w:w="100"/>
@@ -416,7 +416,7 @@
         <w:tc>
           <w:tcPr>
             <w:tcW w:type="dxa" w:w="971"/>
-            <w:shd w:fill="E6F2F1" w:color="auto" w:val="clear"/>
+            <w:shd w:fill="FDF0E3" w:color="auto" w:val="clear"/>
             <w:tcMar>
               <w:top w:type="dxa" w:w="60"/>
               <w:left w:type="dxa" w:w="100"/>
@@ -1031,12 +1031,12 @@
       <w:tblPr>
         <w:tblW w:type="dxa" w:w="9706"/>
         <w:tblBorders>
-          <w:top w:val="single" w:color="9DB8B6" w:sz="4"/>
-          <w:left w:val="single" w:color="9DB8B6" w:sz="4"/>
-          <w:bottom w:val="single" w:color="9DB8B6" w:sz="4"/>
-          <w:right w:val="single" w:color="9DB8B6" w:sz="4"/>
-          <w:insideH w:val="single" w:color="9DB8B6" w:sz="4"/>
-          <w:insideV w:val="single" w:color="9DB8B6" w:sz="4"/>
+          <w:top w:val="single" w:color="BFBFBF" w:sz="4"/>
+          <w:left w:val="single" w:color="BFBFBF" w:sz="4"/>
+          <w:bottom w:val="single" w:color="BFBFBF" w:sz="4"/>
+          <w:right w:val="single" w:color="BFBFBF" w:sz="4"/>
+          <w:insideH w:val="single" w:color="BFBFBF" w:sz="4"/>
+          <w:insideV w:val="single" w:color="BFBFBF" w:sz="4"/>
         </w:tblBorders>
         <w:tblLayout w:type="fixed"/>
       </w:tblPr>
@@ -1052,7 +1052,7 @@
         <w:tc>
           <w:tcPr>
             <w:tcW w:type="dxa" w:w="3203"/>
-            <w:shd w:fill="E6F2F1" w:color="auto" w:val="clear"/>
+            <w:shd w:fill="FDF0E3" w:color="auto" w:val="clear"/>
             <w:tcMar>
               <w:top w:type="dxa" w:w="60"/>
               <w:left w:type="dxa" w:w="100"/>
@@ -1073,7 +1073,7 @@
         <w:tc>
           <w:tcPr>
             <w:tcW w:type="dxa" w:w="3009"/>
-            <w:shd w:fill="E6F2F1" w:color="auto" w:val="clear"/>
+            <w:shd w:fill="FDF0E3" w:color="auto" w:val="clear"/>
             <w:tcMar>
               <w:top w:type="dxa" w:w="60"/>
               <w:left w:type="dxa" w:w="100"/>
@@ -1094,7 +1094,7 @@
         <w:tc>
           <w:tcPr>
             <w:tcW w:type="dxa" w:w="3397"/>
-            <w:shd w:fill="E6F2F1" w:color="auto" w:val="clear"/>
+            <w:shd w:fill="FDF0E3" w:color="auto" w:val="clear"/>
             <w:tcMar>
               <w:top w:type="dxa" w:w="60"/>
               <w:left w:type="dxa" w:w="100"/>
@@ -1397,12 +1397,12 @@
       <w:tblPr>
         <w:tblW w:type="dxa" w:w="9706"/>
         <w:tblBorders>
-          <w:top w:val="single" w:color="9DB8B6" w:sz="4"/>
-          <w:left w:val="single" w:color="9DB8B6" w:sz="4"/>
-          <w:bottom w:val="single" w:color="9DB8B6" w:sz="4"/>
-          <w:right w:val="single" w:color="9DB8B6" w:sz="4"/>
-          <w:insideH w:val="single" w:color="9DB8B6" w:sz="4"/>
-          <w:insideV w:val="single" w:color="9DB8B6" w:sz="4"/>
+          <w:top w:val="single" w:color="BFBFBF" w:sz="4"/>
+          <w:left w:val="single" w:color="BFBFBF" w:sz="4"/>
+          <w:bottom w:val="single" w:color="BFBFBF" w:sz="4"/>
+          <w:right w:val="single" w:color="BFBFBF" w:sz="4"/>
+          <w:insideH w:val="single" w:color="BFBFBF" w:sz="4"/>
+          <w:insideV w:val="single" w:color="BFBFBF" w:sz="4"/>
         </w:tblBorders>
         <w:tblLayout w:type="fixed"/>
       </w:tblPr>
@@ -1419,7 +1419,7 @@
         <w:tc>
           <w:tcPr>
             <w:tcW w:type="dxa" w:w="2329"/>
-            <w:shd w:fill="E6F2F1" w:color="auto" w:val="clear"/>
+            <w:shd w:fill="FDF0E3" w:color="auto" w:val="clear"/>
             <w:tcMar>
               <w:top w:type="dxa" w:w="60"/>
               <w:left w:type="dxa" w:w="100"/>
@@ -1440,7 +1440,7 @@
         <w:tc>
           <w:tcPr>
             <w:tcW w:type="dxa" w:w="2427"/>
-            <w:shd w:fill="E6F2F1" w:color="auto" w:val="clear"/>
+            <w:shd w:fill="FDF0E3" w:color="auto" w:val="clear"/>
             <w:tcMar>
               <w:top w:type="dxa" w:w="60"/>
               <w:left w:type="dxa" w:w="100"/>
@@ -1461,7 +1461,7 @@
         <w:tc>
           <w:tcPr>
             <w:tcW w:type="dxa" w:w="2427"/>
-            <w:shd w:fill="E6F2F1" w:color="auto" w:val="clear"/>
+            <w:shd w:fill="FDF0E3" w:color="auto" w:val="clear"/>
             <w:tcMar>
               <w:top w:type="dxa" w:w="60"/>
               <w:left w:type="dxa" w:w="100"/>
@@ -1482,7 +1482,7 @@
         <w:tc>
           <w:tcPr>
             <w:tcW w:type="dxa" w:w="2427"/>
-            <w:shd w:fill="E6F2F1" w:color="auto" w:val="clear"/>
+            <w:shd w:fill="FDF0E3" w:color="auto" w:val="clear"/>
             <w:tcMar>
               <w:top w:type="dxa" w:w="60"/>
               <w:left w:type="dxa" w:w="100"/>
@@ -2002,12 +2002,12 @@
       <w:tblPr>
         <w:tblW w:type="dxa" w:w="9706"/>
         <w:tblBorders>
-          <w:top w:val="single" w:color="9DB8B6" w:sz="4"/>
-          <w:left w:val="single" w:color="9DB8B6" w:sz="4"/>
-          <w:bottom w:val="single" w:color="9DB8B6" w:sz="4"/>
-          <w:right w:val="single" w:color="9DB8B6" w:sz="4"/>
-          <w:insideH w:val="single" w:color="9DB8B6" w:sz="4"/>
-          <w:insideV w:val="single" w:color="9DB8B6" w:sz="4"/>
+          <w:top w:val="single" w:color="BFBFBF" w:sz="4"/>
+          <w:left w:val="single" w:color="BFBFBF" w:sz="4"/>
+          <w:bottom w:val="single" w:color="BFBFBF" w:sz="4"/>
+          <w:right w:val="single" w:color="BFBFBF" w:sz="4"/>
+          <w:insideH w:val="single" w:color="BFBFBF" w:sz="4"/>
+          <w:insideV w:val="single" w:color="BFBFBF" w:sz="4"/>
         </w:tblBorders>
         <w:tblLayout w:type="fixed"/>
       </w:tblPr>
@@ -2024,7 +2024,7 @@
         <w:tc>
           <w:tcPr>
             <w:tcW w:type="dxa" w:w="1941"/>
-            <w:shd w:fill="E6F2F1" w:color="auto" w:val="clear"/>
+            <w:shd w:fill="FDF0E3" w:color="auto" w:val="clear"/>
             <w:tcMar>
               <w:top w:type="dxa" w:w="60"/>
               <w:left w:type="dxa" w:w="100"/>
@@ -2045,7 +2045,7 @@
         <w:tc>
           <w:tcPr>
             <w:tcW w:type="dxa" w:w="2524"/>
-            <w:shd w:fill="E6F2F1" w:color="auto" w:val="clear"/>
+            <w:shd w:fill="FDF0E3" w:color="auto" w:val="clear"/>
             <w:tcMar>
               <w:top w:type="dxa" w:w="60"/>
               <w:left w:type="dxa" w:w="100"/>
@@ -2066,7 +2066,7 @@
         <w:tc>
           <w:tcPr>
             <w:tcW w:type="dxa" w:w="2524"/>
-            <w:shd w:fill="E6F2F1" w:color="auto" w:val="clear"/>
+            <w:shd w:fill="FDF0E3" w:color="auto" w:val="clear"/>
             <w:tcMar>
               <w:top w:type="dxa" w:w="60"/>
               <w:left w:type="dxa" w:w="100"/>
@@ -2087,7 +2087,7 @@
         <w:tc>
           <w:tcPr>
             <w:tcW w:type="dxa" w:w="2524"/>
-            <w:shd w:fill="E6F2F1" w:color="auto" w:val="clear"/>
+            <w:shd w:fill="FDF0E3" w:color="auto" w:val="clear"/>
             <w:tcMar>
               <w:top w:type="dxa" w:w="60"/>
               <w:left w:type="dxa" w:w="100"/>
@@ -2328,9 +2328,9 @@
     <w:p>
       <w:pPr>
         <w:pBdr>
-          <w:left w:val="single" w:color="0B6E69" w:sz="18" w:space="6"/>
+          <w:left w:val="single" w:color="EF7D00" w:sz="18" w:space="6"/>
         </w:pBdr>
-        <w:shd w:fill="E6F2F1" w:color="auto" w:val="clear"/>
+        <w:shd w:fill="FDF0E3" w:color="auto" w:val="clear"/>
         <w:spacing w:after="60" w:before="60"/>
         <w:ind w:left="200" w:right="200"/>
       </w:pPr>
@@ -2349,12 +2349,12 @@
       <w:tblPr>
         <w:tblW w:type="dxa" w:w="9706"/>
         <w:tblBorders>
-          <w:top w:val="single" w:color="9DB8B6" w:sz="4"/>
-          <w:left w:val="single" w:color="9DB8B6" w:sz="4"/>
-          <w:bottom w:val="single" w:color="9DB8B6" w:sz="4"/>
-          <w:right w:val="single" w:color="9DB8B6" w:sz="4"/>
-          <w:insideH w:val="single" w:color="9DB8B6" w:sz="4"/>
-          <w:insideV w:val="single" w:color="9DB8B6" w:sz="4"/>
+          <w:top w:val="single" w:color="BFBFBF" w:sz="4"/>
+          <w:left w:val="single" w:color="BFBFBF" w:sz="4"/>
+          <w:bottom w:val="single" w:color="BFBFBF" w:sz="4"/>
+          <w:right w:val="single" w:color="BFBFBF" w:sz="4"/>
+          <w:insideH w:val="single" w:color="BFBFBF" w:sz="4"/>
+          <w:insideV w:val="single" w:color="BFBFBF" w:sz="4"/>
         </w:tblBorders>
         <w:tblLayout w:type="fixed"/>
       </w:tblPr>
@@ -2372,7 +2372,7 @@
         <w:tc>
           <w:tcPr>
             <w:tcW w:type="dxa" w:w="679"/>
-            <w:shd w:fill="E6F2F1" w:color="auto" w:val="clear"/>
+            <w:shd w:fill="FDF0E3" w:color="auto" w:val="clear"/>
             <w:tcMar>
               <w:top w:type="dxa" w:w="60"/>
               <w:left w:type="dxa" w:w="100"/>
@@ -2393,7 +2393,7 @@
         <w:tc>
           <w:tcPr>
             <w:tcW w:type="dxa" w:w="2135"/>
-            <w:shd w:fill="E6F2F1" w:color="auto" w:val="clear"/>
+            <w:shd w:fill="FDF0E3" w:color="auto" w:val="clear"/>
             <w:tcMar>
               <w:top w:type="dxa" w:w="60"/>
               <w:left w:type="dxa" w:w="100"/>
@@ -2414,7 +2414,7 @@
         <w:tc>
           <w:tcPr>
             <w:tcW w:type="dxa" w:w="3300"/>
-            <w:shd w:fill="E6F2F1" w:color="auto" w:val="clear"/>
+            <w:shd w:fill="FDF0E3" w:color="auto" w:val="clear"/>
             <w:tcMar>
               <w:top w:type="dxa" w:w="60"/>
               <w:left w:type="dxa" w:w="100"/>
@@ -2435,7 +2435,7 @@
         <w:tc>
           <w:tcPr>
             <w:tcW w:type="dxa" w:w="1068"/>
-            <w:shd w:fill="E6F2F1" w:color="auto" w:val="clear"/>
+            <w:shd w:fill="FDF0E3" w:color="auto" w:val="clear"/>
             <w:tcMar>
               <w:top w:type="dxa" w:w="60"/>
               <w:left w:type="dxa" w:w="100"/>
@@ -2456,7 +2456,7 @@
         <w:tc>
           <w:tcPr>
             <w:tcW w:type="dxa" w:w="2329"/>
-            <w:shd w:fill="E6F2F1" w:color="auto" w:val="clear"/>
+            <w:shd w:fill="FDF0E3" w:color="auto" w:val="clear"/>
             <w:tcMar>
               <w:top w:type="dxa" w:w="60"/>
               <w:left w:type="dxa" w:w="100"/>
@@ -3561,9 +3561,9 @@
     <w:p>
       <w:pPr>
         <w:pBdr>
-          <w:left w:val="single" w:color="0B6E69" w:sz="18" w:space="6"/>
+          <w:left w:val="single" w:color="EF7D00" w:sz="18" w:space="6"/>
         </w:pBdr>
-        <w:shd w:fill="E6F2F1" w:color="auto" w:val="clear"/>
+        <w:shd w:fill="FDF0E3" w:color="auto" w:val="clear"/>
         <w:spacing w:after="60" w:before="60"/>
         <w:ind w:left="200" w:right="200"/>
       </w:pPr>
@@ -3794,12 +3794,12 @@
       <w:tblPr>
         <w:tblW w:type="dxa" w:w="9706"/>
         <w:tblBorders>
-          <w:top w:val="single" w:color="9DB8B6" w:sz="4"/>
-          <w:left w:val="single" w:color="9DB8B6" w:sz="4"/>
-          <w:bottom w:val="single" w:color="9DB8B6" w:sz="4"/>
-          <w:right w:val="single" w:color="9DB8B6" w:sz="4"/>
-          <w:insideH w:val="single" w:color="9DB8B6" w:sz="4"/>
-          <w:insideV w:val="single" w:color="9DB8B6" w:sz="4"/>
+          <w:top w:val="single" w:color="BFBFBF" w:sz="4"/>
+          <w:left w:val="single" w:color="BFBFBF" w:sz="4"/>
+          <w:bottom w:val="single" w:color="BFBFBF" w:sz="4"/>
+          <w:right w:val="single" w:color="BFBFBF" w:sz="4"/>
+          <w:insideH w:val="single" w:color="BFBFBF" w:sz="4"/>
+          <w:insideV w:val="single" w:color="BFBFBF" w:sz="4"/>
         </w:tblBorders>
         <w:tblLayout w:type="fixed"/>
       </w:tblPr>
@@ -3815,7 +3815,7 @@
         <w:tc>
           <w:tcPr>
             <w:tcW w:type="dxa" w:w="874"/>
-            <w:shd w:fill="E6F2F1" w:color="auto" w:val="clear"/>
+            <w:shd w:fill="FDF0E3" w:color="auto" w:val="clear"/>
             <w:tcMar>
               <w:top w:type="dxa" w:w="60"/>
               <w:left w:type="dxa" w:w="100"/>
@@ -3836,7 +3836,7 @@
         <w:tc>
           <w:tcPr>
             <w:tcW w:type="dxa" w:w="4659"/>
-            <w:shd w:fill="E6F2F1" w:color="auto" w:val="clear"/>
+            <w:shd w:fill="FDF0E3" w:color="auto" w:val="clear"/>
             <w:tcMar>
               <w:top w:type="dxa" w:w="60"/>
               <w:left w:type="dxa" w:w="100"/>
@@ -3857,7 +3857,7 @@
         <w:tc>
           <w:tcPr>
             <w:tcW w:type="dxa" w:w="3979"/>
-            <w:shd w:fill="E6F2F1" w:color="auto" w:val="clear"/>
+            <w:shd w:fill="FDF0E3" w:color="auto" w:val="clear"/>
             <w:tcMar>
               <w:top w:type="dxa" w:w="60"/>
               <w:left w:type="dxa" w:w="100"/>
@@ -4377,7 +4377,8 @@
       </w:r>
     </w:p>
     <w:sectPr>
-      <w:footerReference w:type="default" r:id="rId6"/>
+      <w:headerReference w:type="default" r:id="rId6"/>
+      <w:footerReference w:type="default" r:id="rId7"/>
       <w:pgSz w:w="11906" w:h="16838" w:orient="portrait"/>
       <w:pgMar w:top="1000" w:right="1100" w:bottom="1000" w:left="1100" w:header="708" w:footer="708" w:gutter="0"/>
       <w:pgNumType/>
@@ -4490,6 +4491,56 @@
 </w:footnotes>
 </file>
 
+<file path=word/header1.xml><?xml version="1.0" encoding="utf-8"?>
+<w:hdr xmlns:wpc="http://schemas.microsoft.com/office/word/2010/wordprocessingCanvas" xmlns:mc="http://schemas.openxmlformats.org/markup-compatibility/2006" xmlns:o="urn:schemas-microsoft-com:office:office" xmlns:r="http://schemas.openxmlformats.org/officeDocument/2006/relationships" xmlns:m="http://schemas.openxmlformats.org/officeDocument/2006/math" xmlns:v="urn:schemas-microsoft-com:vml" xmlns:wp14="http://schemas.microsoft.com/office/word/2010/wordprocessingDrawing" xmlns:wp="http://schemas.openxmlformats.org/drawingml/2006/wordprocessingDrawing" xmlns:w10="urn:schemas-microsoft-com:office:word" xmlns:w="http://schemas.openxmlformats.org/wordprocessingml/2006/main" xmlns:w14="http://schemas.microsoft.com/office/word/2010/wordml" xmlns:w15="http://schemas.microsoft.com/office/word/2012/wordml" xmlns:wpg="http://schemas.microsoft.com/office/word/2010/wordprocessingGroup" xmlns:wpi="http://schemas.microsoft.com/office/word/2010/wordprocessingInk" xmlns:wne="http://schemas.microsoft.com/office/word/2006/wordml" xmlns:wps="http://schemas.microsoft.com/office/word/2010/wordprocessingShape" xmlns:cx="http://schemas.microsoft.com/office/drawing/2014/chartex" xmlns:cx1="http://schemas.microsoft.com/office/drawing/2015/9/8/chartex" xmlns:cx2="http://schemas.microsoft.com/office/drawing/2015/10/21/chartex" xmlns:cx3="http://schemas.microsoft.com/office/drawing/2016/5/9/chartex" xmlns:cx4="http://schemas.microsoft.com/office/drawing/2016/5/10/chartex" xmlns:cx5="http://schemas.microsoft.com/office/drawing/2016/5/11/chartex" xmlns:cx6="http://schemas.microsoft.com/office/drawing/2016/5/12/chartex" xmlns:cx7="http://schemas.microsoft.com/office/drawing/2016/5/13/chartex" xmlns:cx8="http://schemas.microsoft.com/office/drawing/2016/5/14/chartex" xmlns:w16cid="http://schemas.microsoft.com/office/word/2016/wordml/cid" xmlns:w16se="http://schemas.microsoft.com/office/word/2015/wordml/symex">
+  <w:p>
+    <w:pPr>
+      <w:jc w:val="right"/>
+    </w:pPr>
+    <w:r>
+      <w:drawing>
+        <wp:inline distT="0" distB="0" distL="0" distR="0">
+          <wp:extent cx="2000250" cy="457200"/>
+          <wp:effectExtent t="0" r="0" b="0" l="0"/>
+          <wp:docPr id="1" name="" descr="" title=""/>
+          <wp:cNvGraphicFramePr>
+            <a:graphicFrameLocks xmlns:a="http://schemas.openxmlformats.org/drawingml/2006/main" noChangeAspect="1"/>
+          </wp:cNvGraphicFramePr>
+          <a:graphic xmlns:a="http://schemas.openxmlformats.org/drawingml/2006/main">
+            <a:graphicData uri="http://schemas.openxmlformats.org/drawingml/2006/picture">
+              <pic:pic xmlns:pic="http://schemas.openxmlformats.org/drawingml/2006/picture">
+                <pic:nvPicPr>
+                  <pic:cNvPr id="0" name="" descr=""/>
+                  <pic:cNvPicPr>
+                    <a:picLocks noChangeAspect="1" noChangeArrowheads="1"/>
+                  </pic:cNvPicPr>
+                </pic:nvPicPr>
+                <pic:blipFill>
+                  <a:blip r:embed="rId0" cstate="none"/>
+                  <a:srcRect/>
+                  <a:stretch>
+                    <a:fillRect/>
+                  </a:stretch>
+                </pic:blipFill>
+                <pic:spPr bwMode="auto">
+                  <a:xfrm>
+                    <a:off x="0" y="0"/>
+                    <a:ext cx="2000250" cy="457200"/>
+                  </a:xfrm>
+                  <a:prstGeom prst="rect">
+                    <a:avLst/>
+                  </a:prstGeom>
+                </pic:spPr>
+              </pic:pic>
+            </a:graphicData>
+          </a:graphic>
+        </wp:inline>
+      </w:drawing>
+    </w:r>
+  </w:p>
+</w:hdr>
+</file>
+
 <file path=word/numbering.xml><?xml version="1.0" encoding="utf-8"?>
 <w:numbering xmlns:wpc="http://schemas.microsoft.com/office/word/2010/wordprocessingCanvas" xmlns:mc="http://schemas.openxmlformats.org/markup-compatibility/2006" xmlns:o="urn:schemas-microsoft-com:office:office" xmlns:r="http://schemas.openxmlformats.org/officeDocument/2006/relationships" xmlns:m="http://schemas.openxmlformats.org/officeDocument/2006/math" xmlns:v="urn:schemas-microsoft-com:vml" xmlns:wp14="http://schemas.microsoft.com/office/word/2010/wordprocessingDrawing" xmlns:wp="http://schemas.openxmlformats.org/drawingml/2006/wordprocessingDrawing" xmlns:w10="urn:schemas-microsoft-com:office:word" xmlns:w="http://schemas.openxmlformats.org/wordprocessingml/2006/main" xmlns:w14="http://schemas.microsoft.com/office/word/2010/wordml" xmlns:w15="http://schemas.microsoft.com/office/word/2012/wordml" xmlns:wpg="http://schemas.microsoft.com/office/word/2010/wordprocessingGroup" xmlns:wpi="http://schemas.microsoft.com/office/word/2010/wordprocessingInk" xmlns:wne="http://schemas.microsoft.com/office/word/2006/wordml" xmlns:wps="http://schemas.microsoft.com/office/word/2010/wordprocessingShape" mc:Ignorable="w14 w15 wp14">
   <w:abstractNum w:abstractNumId="1" w15:restartNumberingAfterBreak="0">
@@ -4611,9 +4662,9 @@
   <w:docDefaults>
     <w:rPrDefault>
       <w:rPr>
-        <w:rFonts w:ascii="Calibri" w:cs="Calibri" w:eastAsia="Calibri" w:hAnsi="Calibri"/>
-        <w:sz w:val="22"/>
-        <w:szCs w:val="22"/>
+        <w:rFonts w:ascii="Lucida Sans" w:cs="Lucida Sans" w:eastAsia="Lucida Sans" w:hAnsi="Lucida Sans"/>
+        <w:sz w:val="19"/>
+        <w:szCs w:val="19"/>
       </w:rPr>
     </w:rPrDefault>
     <w:pPrDefault/>
@@ -4757,10 +4808,10 @@
       <w:spacing w:after="160" w:before="240"/>
     </w:pPr>
     <w:rPr>
-      <w:rFonts w:ascii="Cambria" w:cs="Cambria" w:eastAsia="Cambria" w:hAnsi="Cambria"/>
+      <w:rFonts w:ascii="Lucida Sans" w:cs="Lucida Sans" w:eastAsia="Lucida Sans" w:hAnsi="Lucida Sans"/>
       <w:b/>
       <w:bCs/>
-      <w:color w:val="0B6E69"/>
+      <w:color w:val="7A003F"/>
       <w:sz w:val="34"/>
       <w:szCs w:val="34"/>
     </w:rPr>
@@ -4773,10 +4824,10 @@
       <w:spacing w:after="120" w:before="240"/>
     </w:pPr>
     <w:rPr>
-      <w:rFonts w:ascii="Cambria" w:cs="Cambria" w:eastAsia="Cambria" w:hAnsi="Cambria"/>
+      <w:rFonts w:ascii="Lucida Sans" w:cs="Lucida Sans" w:eastAsia="Lucida Sans" w:hAnsi="Lucida Sans"/>
       <w:b/>
       <w:bCs/>
-      <w:color w:val="0B6E69"/>
+      <w:color w:val="7A003F"/>
       <w:sz w:val="28"/>
       <w:szCs w:val="28"/>
     </w:rPr>

</xml_diff>